<commit_message>
Report: state the nature of the counterexamples, and disclose the k-means scan
Section 9 now reports the scatter test on the arrangement embedding: the designs
that dominate the construct are no tighter than a random subset of the same size
(observed 6.87 vs null 6.85, z = +0.15, one-sided p = 0.57), so there is no
copyable arrangement pattern that beats it -- they are the tail of one smooth
distribution.

Section 12 discloses the k-means scan that was run and left out of the body: 2 of
8 k values reached p < 0.05 against 0.4 expected false positives, with effect
sizes of 1.9-3.0% against a 1.45% base rate. k is a free parameter, so the scan is
not evidence; only the k-free scatter test is reported.
</commit_message>
<xml_diff>
--- a/Combined_circDesign_回顾性计算评估报告.docx
+++ b/Combined_circDesign_回顾性计算评估报告.docx
@@ -10259,6 +10259,19 @@
           <w:sz w:val="22"/>
         </w:rPr>
         <w:t>因此“本序列最优”这一表述，只有在指明空间与目标集时才成立。脱离空间的绝对最优与本报告的全部测量结果矛盾。可支持的表述见第十一节。</w:t>
+      </w:r>
+    </w:p>
+    <w:p>
+      <w:pPr>
+        <w:spacing w:before="0" w:after="120" w:line="264" w:lineRule="auto"/>
+      </w:pPr>
+      <w:r>
+        <w:rPr>
+          <w:rFonts w:ascii="Arial" w:hAnsi="Arial" w:eastAsia="Noto Sans CJK SC"/>
+          <w:color w:val="20242A"/>
+          <w:sz w:val="22"/>
+        </w:rPr>
+        <w:t>需要说明这些反例的性质：它们不是一个可描述的类别。把全部 4,000 条候选嵌入排列空间（密码子对残差矩阵，3721 维——实际密码子对数减去在相同密码子多重集随机排列下的精确期望），支配者在其中的离散度与随机抽取同尺寸子集无差异：观测 6.87，随机均值 6.85（SD 0.14），z = +0.15，单尾 p = 0.57。因此不存在“照抄某一排列模式即可超过本构建”的设计路径——它们是同一光滑分布的尾部，而不是一类可复制的解。</w:t>
       </w:r>
     </w:p>
     <w:p>
@@ -10628,6 +10641,21 @@
           <w:sz w:val="21"/>
         </w:rPr>
         <w:t>Pareto 最优性不要求在任何单一目标上领先。本构建在全部七项目标上没有一项排名第一，其位置来自“无方案能同时不劣于它”，而非“它在某处最强”。这一区别在引用时不可省略。</w:t>
+      </w:r>
+    </w:p>
+    <w:p>
+      <w:pPr>
+        <w:pStyle w:val="ListBullet"/>
+        <w:spacing w:after="80" w:line="264" w:lineRule="auto"/>
+        <w:ind w:left="720" w:hanging="360"/>
+      </w:pPr>
+      <w:r>
+        <w:rPr>
+          <w:rFonts w:ascii="Arial" w:hAnsi="Arial" w:eastAsia="Noto Sans CJK SC"/>
+          <w:color w:val="20242A"/>
+          <w:sz w:val="21"/>
+        </w:rPr>
+        <w:t>为检验“是否存在可复制的更好排列类别”，本报告在排列空间还做过一次 k-means 扫描（k = 2 至 12）。8 个 k 值中有 2 个的富集检验达到 p &lt; 0.05，与期望假阳性 0.4 条相当，且效应量极小（最富集簇的支配率 1.9–3.0%，整体为 1.45%）。该扫描的自由参数 k本身构成搜索空间，单独不构成证据，故正文只报告不依赖 k 的散布检验。两者均见 arrangement_clusters.json。</w:t>
       </w:r>
     </w:p>
     <w:tbl>

</xml_diff>

<commit_message>
Persist the secondary structure of all 261 candidates
The pipeline computed the MFE dot-bracket for every candidate and kept it only
for the original, so any later structural analysis of the reference set needed a
full refold. Fixed at the source, and back-filled by persist_structures.py, which
computes the structures separately rather than re-running the pipeline -- a re-run
would overwrite candidate_metrics.csv, and that file cannot be reproduced by the
delivered source.

Both guards pass: the spliced construct reproduces its recorded MFE, and all 261
recomputed energies match the delivered column to 0.000000, confirming the
structures belong to the delivered reference set. 261 sequences in 71 s.

Full base-pair-probability matrices remain unpersisted (~4 GB dense) and are
documented as such in the report's limitations.
</commit_message>
<xml_diff>
--- a/Combined_circDesign_回顾性计算评估报告.docx
+++ b/Combined_circDesign_回顾性计算评估报告.docx
@@ -10580,6 +10580,21 @@
           <w:color w:val="20242A"/>
           <w:sz w:val="21"/>
         </w:rPr>
+        <w:t>原实现只保留了原序列的二级结构串，261 条候选的其余 260 条被丢弃，任何后续结构分析都需整体重折。现已补齐（structures_261.csv）。完整碱基配对概率矩阵仍未落盘：单条为 2013×2013 稠密矩阵（约 16 MB），全集约 4 GB，超出交付包体积；它们可由序列在秒级内重算。</w:t>
+      </w:r>
+    </w:p>
+    <w:p>
+      <w:pPr>
+        <w:pStyle w:val="ListBullet"/>
+        <w:spacing w:after="80" w:line="264" w:lineRule="auto"/>
+        <w:ind w:left="720" w:hanging="360"/>
+      </w:pPr>
+      <w:r>
+        <w:rPr>
+          <w:rFonts w:ascii="Arial" w:hAnsi="Arial" w:eastAsia="Noto Sans CJK SC"/>
+          <w:color w:val="20242A"/>
+          <w:sz w:val="21"/>
+        </w:rPr>
         <w:t>成熟环边界依据 feature 注释推断，尚需 junction sequencing 对实验产物身份进行最终确认。</w:t>
       </w:r>
     </w:p>
@@ -11929,6 +11944,58 @@
                 <w:sz w:val="17"/>
               </w:rPr>
               <w:t>二维预测与三维模型比对（受限于旧版模型）</w:t>
+            </w:r>
+          </w:p>
+        </w:tc>
+      </w:tr>
+      <w:tr>
+        <w:tc>
+          <w:tcPr>
+            <w:tcW w:type="dxa" w:w="3900"/>
+            <w:tcMar>
+              <w:top w:w="90" w:type="dxa"/>
+              <w:start w:w="120" w:type="dxa"/>
+              <w:bottom w:w="90" w:type="dxa"/>
+              <w:end w:w="120" w:type="dxa"/>
+            </w:tcMar>
+            <w:vAlign w:val="center"/>
+          </w:tcPr>
+          <w:p>
+            <w:pPr>
+              <w:spacing w:before="0" w:after="0" w:line="259" w:lineRule="auto"/>
+            </w:pPr>
+            <w:r>
+              <w:rPr>
+                <w:rFonts w:ascii="Arial" w:hAnsi="Arial" w:eastAsia="Noto Sans CJK SC"/>
+                <w:color w:val="20242A"/>
+                <w:sz w:val="17"/>
+              </w:rPr>
+              <w:t>persist_structures.py / structures_261.csv</w:t>
+            </w:r>
+          </w:p>
+        </w:tc>
+        <w:tc>
+          <w:tcPr>
+            <w:tcW w:type="dxa" w:w="5460"/>
+            <w:tcMar>
+              <w:top w:w="90" w:type="dxa"/>
+              <w:start w:w="120" w:type="dxa"/>
+              <w:bottom w:w="90" w:type="dxa"/>
+              <w:end w:w="120" w:type="dxa"/>
+            </w:tcMar>
+            <w:vAlign w:val="center"/>
+          </w:tcPr>
+          <w:p>
+            <w:pPr>
+              <w:spacing w:before="0" w:after="0" w:line="259" w:lineRule="auto"/>
+            </w:pPr>
+            <w:r>
+              <w:rPr>
+                <w:rFonts w:ascii="Arial" w:hAnsi="Arial" w:eastAsia="Noto Sans CJK SC"/>
+                <w:color w:val="20242A"/>
+                <w:sz w:val="17"/>
+              </w:rPr>
+              <w:t>261 条候选的 circular MFE 二级结构串（原实现只保留了原序列一条）</w:t>
             </w:r>
           </w:p>
         </w:tc>

</xml_diff>

<commit_message>
Validate the spacer accessibility result out of sample
The report's one positive structural result -- IRES-CDS spacer accessibility at
the 91.2nd percentile -- rested on a single 250-design background and was the
only headline number without an out-of-sample check. Every other result in the
project had been replicated across seeds.

Fresh background: 500 buildable designs drawn from the unused seed offset 9999.
Result: spacer 92.6% (bootstrap 95% CI [90.2, 94.8]) against the reported 91.2%.
TIR and longest-helix replicate closely; CDS accessibility lands at the 27.6th
percentile against the reported 33.2nd, within sampling variation between two
backgrounds of different size and population.

One convention error was caught while writing this up: the report stores
'percent_better_than_construct' (fraction better) while validate_spacer stores a
percentile (fraction worse). The first draft compared the two directly. Both
sentences now use percentiles.
</commit_message>
<xml_diff>
--- a/Combined_circDesign_回顾性计算评估报告.docx
+++ b/Combined_circDesign_回顾性计算评估报告.docx
@@ -7928,6 +7928,19 @@
           <w:sz w:val="22"/>
         </w:rPr>
         <w:t>其中 IRES–CDS 间隔区可及性是一个明确的正向结果：本构建位于可建成设计的第 91.2 百分位，即约 91% 的同义设计在该项上不如它。该区域是核糖体由 IRES 转入起始密码子的通道，其可及性直接影响翻译起始效率，而它在本次分析之前并未被任何一项原目标覆盖。</w:t>
+      </w:r>
+    </w:p>
+    <w:p>
+      <w:pPr>
+        <w:spacing w:before="0" w:after="120" w:line="264" w:lineRule="auto"/>
+      </w:pPr>
+      <w:r>
+        <w:rPr>
+          <w:rFonts w:ascii="Arial" w:hAnsi="Arial" w:eastAsia="Noto Sans CJK SC"/>
+          <w:color w:val="20242A"/>
+          <w:sz w:val="22"/>
+        </w:rPr>
+        <w:t>该结果已做样本外复现：以未使用过的随机种子重新抽取 500 条可建成设计作为独立背景，本构建的间隔区可及性位次为 92.6%（自助法 95% 区间 [90.2, 94.8]），与本节报告的 91.2% 一致。同一验证也覆盖了其余三项指标；TIR 与最长螺旋复现良好，CDS 全局可及性的位次也基本一致（本节第 33.2 百分位，新背景第 27.6 百分位），差异在背景样本量与总体抽样波动范围内。详见 validate_spacer.json。</w:t>
       </w:r>
     </w:p>
     <w:p>
@@ -11996,6 +12009,58 @@
                 <w:sz w:val="17"/>
               </w:rPr>
               <w:t>261 条候选的 circular MFE 二级结构串（原实现只保留了原序列一条）</w:t>
+            </w:r>
+          </w:p>
+        </w:tc>
+      </w:tr>
+      <w:tr>
+        <w:tc>
+          <w:tcPr>
+            <w:tcW w:type="dxa" w:w="3900"/>
+            <w:tcMar>
+              <w:top w:w="90" w:type="dxa"/>
+              <w:start w:w="120" w:type="dxa"/>
+              <w:bottom w:w="90" w:type="dxa"/>
+              <w:end w:w="120" w:type="dxa"/>
+            </w:tcMar>
+            <w:vAlign w:val="center"/>
+          </w:tcPr>
+          <w:p>
+            <w:pPr>
+              <w:spacing w:before="0" w:after="0" w:line="259" w:lineRule="auto"/>
+            </w:pPr>
+            <w:r>
+              <w:rPr>
+                <w:rFonts w:ascii="Arial" w:hAnsi="Arial" w:eastAsia="Noto Sans CJK SC"/>
+                <w:color w:val="20242A"/>
+                <w:sz w:val="17"/>
+              </w:rPr>
+              <w:t>validate_spacer.py / validate_spacer.json</w:t>
+            </w:r>
+          </w:p>
+        </w:tc>
+        <w:tc>
+          <w:tcPr>
+            <w:tcW w:type="dxa" w:w="5460"/>
+            <w:tcMar>
+              <w:top w:w="90" w:type="dxa"/>
+              <w:start w:w="120" w:type="dxa"/>
+              <w:bottom w:w="90" w:type="dxa"/>
+              <w:end w:w="120" w:type="dxa"/>
+            </w:tcMar>
+            <w:vAlign w:val="center"/>
+          </w:tcPr>
+          <w:p>
+            <w:pPr>
+              <w:spacing w:before="0" w:after="0" w:line="259" w:lineRule="auto"/>
+            </w:pPr>
+            <w:r>
+              <w:rPr>
+                <w:rFonts w:ascii="Arial" w:hAnsi="Arial" w:eastAsia="Noto Sans CJK SC"/>
+                <w:color w:val="20242A"/>
+                <w:sz w:val="17"/>
+              </w:rPr>
+              <w:t>可及性各指标的样本外复现（独立种子背景 500 条）</w:t>
             </w:r>
           </w:p>
         </w:tc>

</xml_diff>